<commit_message>
Added sample audio files
</commit_message>
<xml_diff>
--- a/BlockBreaker/Credits.docx
+++ b/BlockBreaker/Credits.docx
@@ -2,10 +2,326 @@
 <file path=word/document.xml><?xml version="1.0" encoding="utf-8"?>
 <w:document xmlns:wpc="http://schemas.microsoft.com/office/word/2010/wordprocessingCanvas" xmlns:cx="http://schemas.microsoft.com/office/drawing/2014/chartex" xmlns:cx1="http://schemas.microsoft.com/office/drawing/2015/9/8/chartex" xmlns:cx2="http://schemas.microsoft.com/office/drawing/2015/10/21/chartex" xmlns:cx3="http://schemas.microsoft.com/office/drawing/2016/5/9/chartex" xmlns:cx4="http://schemas.microsoft.com/office/drawing/2016/5/10/chartex" xmlns:cx5="http://schemas.microsoft.com/office/drawing/2016/5/11/chartex" xmlns:cx6="http://schemas.microsoft.com/office/drawing/2016/5/12/chartex" xmlns:cx7="http://schemas.microsoft.com/office/drawing/2016/5/13/chartex" xmlns:cx8="http://schemas.microsoft.com/office/drawing/2016/5/14/chartex" xmlns:mc="http://schemas.openxmlformats.org/markup-compatibility/2006" xmlns:aink="http://schemas.microsoft.com/office/drawing/2016/ink" xmlns:am3d="http://schemas.microsoft.com/office/drawing/2017/model3d" xmlns:o="urn:schemas-microsoft-com:office:office" xmlns:oel="http://schemas.microsoft.com/office/2019/extlst" xmlns:r="http://schemas.openxmlformats.org/officeDocument/2006/relationships" xmlns:m="http://schemas.openxmlformats.org/officeDocument/2006/math" xmlns:v="urn:schemas-microsoft-com:vml" xmlns:wp14="http://schemas.microsoft.com/office/word/2010/wordprocessingDrawing" xmlns:wp="http://schemas.openxmlformats.org/drawingml/2006/wordprocessingDrawing" xmlns:w10="urn:schemas-microsoft-com:office:word" xmlns:w="http://schemas.openxmlformats.org/wordprocessingml/2006/main" xmlns:w14="http://schemas.microsoft.com/office/word/2010/wordml" xmlns:w15="http://schemas.microsoft.com/office/word/2012/wordml" xmlns:w16cex="http://schemas.microsoft.com/office/word/2018/wordml/cex" xmlns:w16cid="http://schemas.microsoft.com/office/word/2016/wordml/cid" xmlns:w16="http://schemas.microsoft.com/office/word/2018/wordml" xmlns:w16du="http://schemas.microsoft.com/office/word/2023/wordml/word16du" xmlns:w16sdtdh="http://schemas.microsoft.com/office/word/2020/wordml/sdtdatahash" xmlns:w16sdtfl="http://schemas.microsoft.com/office/word/2024/wordml/sdtformatlock" xmlns:w16se="http://schemas.microsoft.com/office/word/2015/wordml/symex" xmlns:wpg="http://schemas.microsoft.com/office/word/2010/wordprocessingGroup" xmlns:wpi="http://schemas.microsoft.com/office/word/2010/wordprocessingInk" xmlns:wne="http://schemas.microsoft.com/office/word/2006/wordml" xmlns:wps="http://schemas.microsoft.com/office/word/2010/wordprocessingShape" mc:Ignorable="w14 w15 w16se w16cid w16 w16cex w16sdtdh w16sdtfl w16du wp14">
   <w:body>
-    <w:p/>
+    <w:tbl>
+      <w:tblPr>
+        <w:tblStyle w:val="GridTable4-Accent1"/>
+        <w:tblW w:w="0" w:type="auto"/>
+        <w:tblLayout w:type="fixed"/>
+        <w:tblLook w:val="04A0" w:firstRow="1" w:lastRow="0" w:firstColumn="1" w:lastColumn="0" w:noHBand="0" w:noVBand="1"/>
+      </w:tblPr>
+      <w:tblGrid>
+        <w:gridCol w:w="3681"/>
+        <w:gridCol w:w="1701"/>
+        <w:gridCol w:w="3685"/>
+        <w:gridCol w:w="1276"/>
+      </w:tblGrid>
+      <w:tr>
+        <w:trPr>
+          <w:cnfStyle w:val="100000000000" w:firstRow="1" w:lastRow="0" w:firstColumn="0" w:lastColumn="0" w:oddVBand="0" w:evenVBand="0" w:oddHBand="0" w:evenHBand="0" w:firstRowFirstColumn="0" w:firstRowLastColumn="0" w:lastRowFirstColumn="0" w:lastRowLastColumn="0"/>
+        </w:trPr>
+        <w:tc>
+          <w:tcPr>
+            <w:cnfStyle w:val="001000000000" w:firstRow="0" w:lastRow="0" w:firstColumn="1" w:lastColumn="0" w:oddVBand="0" w:evenVBand="0" w:oddHBand="0" w:evenHBand="0" w:firstRowFirstColumn="0" w:firstRowLastColumn="0" w:lastRowFirstColumn="0" w:lastRowLastColumn="0"/>
+            <w:tcW w:w="3681" w:type="dxa"/>
+          </w:tcPr>
+          <w:p>
+            <w:pPr>
+              <w:rPr>
+                <w:sz w:val="20"/>
+                <w:szCs w:val="20"/>
+              </w:rPr>
+            </w:pPr>
+            <w:r>
+              <w:rPr>
+                <w:sz w:val="20"/>
+                <w:szCs w:val="20"/>
+              </w:rPr>
+              <w:t>Asset</w:t>
+            </w:r>
+          </w:p>
+        </w:tc>
+        <w:tc>
+          <w:tcPr>
+            <w:tcW w:w="1701" w:type="dxa"/>
+          </w:tcPr>
+          <w:p>
+            <w:pPr>
+              <w:cnfStyle w:val="100000000000" w:firstRow="1" w:lastRow="0" w:firstColumn="0" w:lastColumn="0" w:oddVBand="0" w:evenVBand="0" w:oddHBand="0" w:evenHBand="0" w:firstRowFirstColumn="0" w:firstRowLastColumn="0" w:lastRowFirstColumn="0" w:lastRowLastColumn="0"/>
+              <w:rPr>
+                <w:sz w:val="20"/>
+                <w:szCs w:val="20"/>
+              </w:rPr>
+            </w:pPr>
+            <w:r>
+              <w:rPr>
+                <w:sz w:val="20"/>
+                <w:szCs w:val="20"/>
+              </w:rPr>
+              <w:t>Author</w:t>
+            </w:r>
+          </w:p>
+        </w:tc>
+        <w:tc>
+          <w:tcPr>
+            <w:tcW w:w="3685" w:type="dxa"/>
+          </w:tcPr>
+          <w:p>
+            <w:pPr>
+              <w:cnfStyle w:val="100000000000" w:firstRow="1" w:lastRow="0" w:firstColumn="0" w:lastColumn="0" w:oddVBand="0" w:evenVBand="0" w:oddHBand="0" w:evenHBand="0" w:firstRowFirstColumn="0" w:firstRowLastColumn="0" w:lastRowFirstColumn="0" w:lastRowLastColumn="0"/>
+              <w:rPr>
+                <w:sz w:val="20"/>
+                <w:szCs w:val="20"/>
+              </w:rPr>
+            </w:pPr>
+            <w:r>
+              <w:rPr>
+                <w:sz w:val="20"/>
+                <w:szCs w:val="20"/>
+              </w:rPr>
+              <w:t>URL</w:t>
+            </w:r>
+          </w:p>
+        </w:tc>
+        <w:tc>
+          <w:tcPr>
+            <w:tcW w:w="1276" w:type="dxa"/>
+          </w:tcPr>
+          <w:p>
+            <w:pPr>
+              <w:cnfStyle w:val="100000000000" w:firstRow="1" w:lastRow="0" w:firstColumn="0" w:lastColumn="0" w:oddVBand="0" w:evenVBand="0" w:oddHBand="0" w:evenHBand="0" w:firstRowFirstColumn="0" w:firstRowLastColumn="0" w:lastRowFirstColumn="0" w:lastRowLastColumn="0"/>
+              <w:rPr>
+                <w:sz w:val="20"/>
+                <w:szCs w:val="20"/>
+              </w:rPr>
+            </w:pPr>
+            <w:r>
+              <w:rPr>
+                <w:sz w:val="20"/>
+                <w:szCs w:val="20"/>
+              </w:rPr>
+              <w:t>License</w:t>
+            </w:r>
+          </w:p>
+        </w:tc>
+      </w:tr>
+      <w:tr>
+        <w:trPr>
+          <w:cnfStyle w:val="000000100000" w:firstRow="0" w:lastRow="0" w:firstColumn="0" w:lastColumn="0" w:oddVBand="0" w:evenVBand="0" w:oddHBand="1" w:evenHBand="0" w:firstRowFirstColumn="0" w:firstRowLastColumn="0" w:lastRowFirstColumn="0" w:lastRowLastColumn="0"/>
+        </w:trPr>
+        <w:tc>
+          <w:tcPr>
+            <w:cnfStyle w:val="001000000000" w:firstRow="0" w:lastRow="0" w:firstColumn="1" w:lastColumn="0" w:oddVBand="0" w:evenVBand="0" w:oddHBand="0" w:evenHBand="0" w:firstRowFirstColumn="0" w:firstRowLastColumn="0" w:lastRowFirstColumn="0" w:lastRowLastColumn="0"/>
+            <w:tcW w:w="3681" w:type="dxa"/>
+          </w:tcPr>
+          <w:p>
+            <w:pPr>
+              <w:rPr>
+                <w:sz w:val="20"/>
+                <w:szCs w:val="20"/>
+              </w:rPr>
+            </w:pPr>
+            <w:r>
+              <w:rPr>
+                <w:sz w:val="20"/>
+                <w:szCs w:val="20"/>
+              </w:rPr>
+              <w:t>ICEBrk_Break04_InMotionAudio_FREESampleSunday</w:t>
+            </w:r>
+            <w:r>
+              <w:rPr>
+                <w:sz w:val="20"/>
+                <w:szCs w:val="20"/>
+              </w:rPr>
+              <w:t xml:space="preserve"> renamed to brick_break.wav</w:t>
+            </w:r>
+          </w:p>
+        </w:tc>
+        <w:tc>
+          <w:tcPr>
+            <w:tcW w:w="1701" w:type="dxa"/>
+          </w:tcPr>
+          <w:p>
+            <w:pPr>
+              <w:cnfStyle w:val="000000100000" w:firstRow="0" w:lastRow="0" w:firstColumn="0" w:lastColumn="0" w:oddVBand="0" w:evenVBand="0" w:oddHBand="1" w:evenHBand="0" w:firstRowFirstColumn="0" w:firstRowLastColumn="0" w:lastRowFirstColumn="0" w:lastRowLastColumn="0"/>
+              <w:rPr>
+                <w:sz w:val="20"/>
+                <w:szCs w:val="20"/>
+              </w:rPr>
+            </w:pPr>
+            <w:proofErr w:type="spellStart"/>
+            <w:r>
+              <w:rPr>
+                <w:sz w:val="20"/>
+                <w:szCs w:val="20"/>
+              </w:rPr>
+              <w:t>InMotionAudio</w:t>
+            </w:r>
+            <w:proofErr w:type="spellEnd"/>
+          </w:p>
+        </w:tc>
+        <w:tc>
+          <w:tcPr>
+            <w:tcW w:w="3685" w:type="dxa"/>
+          </w:tcPr>
+          <w:p>
+            <w:pPr>
+              <w:cnfStyle w:val="000000100000" w:firstRow="0" w:lastRow="0" w:firstColumn="0" w:lastColumn="0" w:oddVBand="0" w:evenVBand="0" w:oddHBand="1" w:evenHBand="0" w:firstRowFirstColumn="0" w:firstRowLastColumn="0" w:lastRowFirstColumn="0" w:lastRowLastColumn="0"/>
+              <w:rPr>
+                <w:sz w:val="20"/>
+                <w:szCs w:val="20"/>
+              </w:rPr>
+            </w:pPr>
+            <w:hyperlink r:id="rId4" w:history="1">
+              <w:r>
+                <w:rPr>
+                  <w:rStyle w:val="Hyperlink"/>
+                  <w:sz w:val="20"/>
+                  <w:szCs w:val="20"/>
+                </w:rPr>
+                <w:t>https://freesound.org/s/719973/</w:t>
+              </w:r>
+            </w:hyperlink>
+          </w:p>
+        </w:tc>
+        <w:tc>
+          <w:tcPr>
+            <w:tcW w:w="1276" w:type="dxa"/>
+          </w:tcPr>
+          <w:p>
+            <w:pPr>
+              <w:cnfStyle w:val="000000100000" w:firstRow="0" w:lastRow="0" w:firstColumn="0" w:lastColumn="0" w:oddVBand="0" w:evenVBand="0" w:oddHBand="1" w:evenHBand="0" w:firstRowFirstColumn="0" w:firstRowLastColumn="0" w:lastRowFirstColumn="0" w:lastRowLastColumn="0"/>
+              <w:rPr>
+                <w:sz w:val="20"/>
+                <w:szCs w:val="20"/>
+              </w:rPr>
+            </w:pPr>
+            <w:r>
+              <w:rPr>
+                <w:sz w:val="20"/>
+                <w:szCs w:val="20"/>
+              </w:rPr>
+              <w:t>CC0</w:t>
+            </w:r>
+          </w:p>
+        </w:tc>
+      </w:tr>
+      <w:tr>
+        <w:tc>
+          <w:tcPr>
+            <w:cnfStyle w:val="001000000000" w:firstRow="0" w:lastRow="0" w:firstColumn="1" w:lastColumn="0" w:oddVBand="0" w:evenVBand="0" w:oddHBand="0" w:evenHBand="0" w:firstRowFirstColumn="0" w:firstRowLastColumn="0" w:lastRowFirstColumn="0" w:lastRowLastColumn="0"/>
+            <w:tcW w:w="3681" w:type="dxa"/>
+          </w:tcPr>
+          <w:p>
+            <w:pPr>
+              <w:rPr>
+                <w:sz w:val="20"/>
+                <w:szCs w:val="20"/>
+              </w:rPr>
+            </w:pPr>
+            <w:r>
+              <w:rPr>
+                <w:sz w:val="20"/>
+                <w:szCs w:val="20"/>
+              </w:rPr>
+              <w:t>Boing 1</w:t>
+            </w:r>
+            <w:r>
+              <w:rPr>
+                <w:sz w:val="20"/>
+                <w:szCs w:val="20"/>
+              </w:rPr>
+              <w:t xml:space="preserve"> renamed to ball_bounce</w:t>
+            </w:r>
+            <w:r>
+              <w:rPr>
+                <w:sz w:val="20"/>
+                <w:szCs w:val="20"/>
+              </w:rPr>
+              <w:t>.wav</w:t>
+            </w:r>
+          </w:p>
+        </w:tc>
+        <w:tc>
+          <w:tcPr>
+            <w:tcW w:w="1701" w:type="dxa"/>
+          </w:tcPr>
+          <w:p>
+            <w:pPr>
+              <w:cnfStyle w:val="000000000000" w:firstRow="0" w:lastRow="0" w:firstColumn="0" w:lastColumn="0" w:oddVBand="0" w:evenVBand="0" w:oddHBand="0" w:evenHBand="0" w:firstRowFirstColumn="0" w:firstRowLastColumn="0" w:lastRowFirstColumn="0" w:lastRowLastColumn="0"/>
+              <w:rPr>
+                <w:sz w:val="20"/>
+                <w:szCs w:val="20"/>
+              </w:rPr>
+            </w:pPr>
+            <w:proofErr w:type="spellStart"/>
+            <w:r>
+              <w:rPr>
+                <w:sz w:val="20"/>
+                <w:szCs w:val="20"/>
+              </w:rPr>
+              <w:t>magnuswaker</w:t>
+            </w:r>
+            <w:proofErr w:type="spellEnd"/>
+          </w:p>
+        </w:tc>
+        <w:tc>
+          <w:tcPr>
+            <w:tcW w:w="3685" w:type="dxa"/>
+          </w:tcPr>
+          <w:p>
+            <w:pPr>
+              <w:cnfStyle w:val="000000000000" w:firstRow="0" w:lastRow="0" w:firstColumn="0" w:lastColumn="0" w:oddVBand="0" w:evenVBand="0" w:oddHBand="0" w:evenHBand="0" w:firstRowFirstColumn="0" w:firstRowLastColumn="0" w:lastRowFirstColumn="0" w:lastRowLastColumn="0"/>
+              <w:rPr>
+                <w:sz w:val="20"/>
+                <w:szCs w:val="20"/>
+              </w:rPr>
+            </w:pPr>
+            <w:hyperlink r:id="rId5" w:history="1">
+              <w:r>
+                <w:rPr>
+                  <w:rStyle w:val="Hyperlink"/>
+                  <w:sz w:val="20"/>
+                  <w:szCs w:val="20"/>
+                </w:rPr>
+                <w:t>https://freesound.org/s/540788/</w:t>
+              </w:r>
+            </w:hyperlink>
+          </w:p>
+        </w:tc>
+        <w:tc>
+          <w:tcPr>
+            <w:tcW w:w="1276" w:type="dxa"/>
+          </w:tcPr>
+          <w:p>
+            <w:pPr>
+              <w:cnfStyle w:val="000000000000" w:firstRow="0" w:lastRow="0" w:firstColumn="0" w:lastColumn="0" w:oddVBand="0" w:evenVBand="0" w:oddHBand="0" w:evenHBand="0" w:firstRowFirstColumn="0" w:firstRowLastColumn="0" w:lastRowFirstColumn="0" w:lastRowLastColumn="0"/>
+              <w:rPr>
+                <w:sz w:val="20"/>
+                <w:szCs w:val="20"/>
+              </w:rPr>
+            </w:pPr>
+            <w:r>
+              <w:rPr>
+                <w:sz w:val="20"/>
+                <w:szCs w:val="20"/>
+              </w:rPr>
+              <w:t>CC0</w:t>
+            </w:r>
+          </w:p>
+        </w:tc>
+      </w:tr>
+    </w:tbl>
+    <w:p>
+      <w:pPr>
+        <w:rPr>
+          <w:sz w:val="20"/>
+          <w:szCs w:val="20"/>
+        </w:rPr>
+      </w:pPr>
+    </w:p>
     <w:sectPr>
       <w:pgSz w:w="11906" w:h="16838"/>
-      <w:pgMar w:top="1440" w:right="1440" w:bottom="1440" w:left="1440" w:header="708" w:footer="708" w:gutter="0"/>
+      <w:pgMar w:top="720" w:right="720" w:bottom="720" w:left="720" w:header="708" w:footer="708" w:gutter="0"/>
       <w:cols w:space="708"/>
       <w:docGrid w:linePitch="360"/>
     </w:sectPr>
@@ -930,6 +1246,124 @@
       <w:spacing w:val="5"/>
     </w:rPr>
   </w:style>
+  <w:style w:type="table" w:styleId="TableGrid">
+    <w:name w:val="Table Grid"/>
+    <w:basedOn w:val="TableNormal"/>
+    <w:uiPriority w:val="39"/>
+    <w:rsid w:val="00CF6FE0"/>
+    <w:pPr>
+      <w:spacing w:after="0" w:line="240" w:lineRule="auto"/>
+    </w:pPr>
+    <w:tblPr>
+      <w:tblBorders>
+        <w:top w:val="single" w:sz="4" w:space="0" w:color="auto"/>
+        <w:left w:val="single" w:sz="4" w:space="0" w:color="auto"/>
+        <w:bottom w:val="single" w:sz="4" w:space="0" w:color="auto"/>
+        <w:right w:val="single" w:sz="4" w:space="0" w:color="auto"/>
+        <w:insideH w:val="single" w:sz="4" w:space="0" w:color="auto"/>
+        <w:insideV w:val="single" w:sz="4" w:space="0" w:color="auto"/>
+      </w:tblBorders>
+    </w:tblPr>
+  </w:style>
+  <w:style w:type="table" w:styleId="GridTable4-Accent1">
+    <w:name w:val="Grid Table 4 Accent 1"/>
+    <w:basedOn w:val="TableNormal"/>
+    <w:uiPriority w:val="49"/>
+    <w:rsid w:val="00CF6FE0"/>
+    <w:pPr>
+      <w:spacing w:after="0" w:line="240" w:lineRule="auto"/>
+    </w:pPr>
+    <w:tblPr>
+      <w:tblStyleRowBandSize w:val="1"/>
+      <w:tblStyleColBandSize w:val="1"/>
+      <w:tblBorders>
+        <w:top w:val="single" w:sz="4" w:space="0" w:color="45B0E1" w:themeColor="accent1" w:themeTint="99"/>
+        <w:left w:val="single" w:sz="4" w:space="0" w:color="45B0E1" w:themeColor="accent1" w:themeTint="99"/>
+        <w:bottom w:val="single" w:sz="4" w:space="0" w:color="45B0E1" w:themeColor="accent1" w:themeTint="99"/>
+        <w:right w:val="single" w:sz="4" w:space="0" w:color="45B0E1" w:themeColor="accent1" w:themeTint="99"/>
+        <w:insideH w:val="single" w:sz="4" w:space="0" w:color="45B0E1" w:themeColor="accent1" w:themeTint="99"/>
+        <w:insideV w:val="single" w:sz="4" w:space="0" w:color="45B0E1" w:themeColor="accent1" w:themeTint="99"/>
+      </w:tblBorders>
+    </w:tblPr>
+    <w:tblStylePr w:type="firstRow">
+      <w:rPr>
+        <w:b/>
+        <w:bCs/>
+        <w:color w:val="FFFFFF" w:themeColor="background1"/>
+      </w:rPr>
+      <w:tblPr/>
+      <w:tcPr>
+        <w:tcBorders>
+          <w:top w:val="single" w:sz="4" w:space="0" w:color="156082" w:themeColor="accent1"/>
+          <w:left w:val="single" w:sz="4" w:space="0" w:color="156082" w:themeColor="accent1"/>
+          <w:bottom w:val="single" w:sz="4" w:space="0" w:color="156082" w:themeColor="accent1"/>
+          <w:right w:val="single" w:sz="4" w:space="0" w:color="156082" w:themeColor="accent1"/>
+          <w:insideH w:val="nil"/>
+          <w:insideV w:val="nil"/>
+        </w:tcBorders>
+        <w:shd w:val="clear" w:color="auto" w:fill="156082" w:themeFill="accent1"/>
+      </w:tcPr>
+    </w:tblStylePr>
+    <w:tblStylePr w:type="lastRow">
+      <w:rPr>
+        <w:b/>
+        <w:bCs/>
+      </w:rPr>
+      <w:tblPr/>
+      <w:tcPr>
+        <w:tcBorders>
+          <w:top w:val="double" w:sz="4" w:space="0" w:color="156082" w:themeColor="accent1"/>
+        </w:tcBorders>
+      </w:tcPr>
+    </w:tblStylePr>
+    <w:tblStylePr w:type="firstCol">
+      <w:rPr>
+        <w:b/>
+        <w:bCs/>
+      </w:rPr>
+    </w:tblStylePr>
+    <w:tblStylePr w:type="lastCol">
+      <w:rPr>
+        <w:b/>
+        <w:bCs/>
+      </w:rPr>
+    </w:tblStylePr>
+    <w:tblStylePr w:type="band1Vert">
+      <w:tblPr/>
+      <w:tcPr>
+        <w:shd w:val="clear" w:color="auto" w:fill="C1E4F5" w:themeFill="accent1" w:themeFillTint="33"/>
+      </w:tcPr>
+    </w:tblStylePr>
+    <w:tblStylePr w:type="band1Horz">
+      <w:tblPr/>
+      <w:tcPr>
+        <w:shd w:val="clear" w:color="auto" w:fill="C1E4F5" w:themeFill="accent1" w:themeFillTint="33"/>
+      </w:tcPr>
+    </w:tblStylePr>
+  </w:style>
+  <w:style w:type="character" w:styleId="Hyperlink">
+    <w:name w:val="Hyperlink"/>
+    <w:basedOn w:val="DefaultParagraphFont"/>
+    <w:uiPriority w:val="99"/>
+    <w:unhideWhenUsed/>
+    <w:rsid w:val="00C55CA3"/>
+    <w:rPr>
+      <w:color w:val="467886" w:themeColor="hyperlink"/>
+      <w:u w:val="single"/>
+    </w:rPr>
+  </w:style>
+  <w:style w:type="character" w:styleId="UnresolvedMention">
+    <w:name w:val="Unresolved Mention"/>
+    <w:basedOn w:val="DefaultParagraphFont"/>
+    <w:uiPriority w:val="99"/>
+    <w:semiHidden/>
+    <w:unhideWhenUsed/>
+    <w:rsid w:val="00C55CA3"/>
+    <w:rPr>
+      <w:color w:val="605E5C"/>
+      <w:shd w:val="clear" w:color="auto" w:fill="E1DFDD"/>
+    </w:rPr>
+  </w:style>
 </w:styles>
 </file>
 

</xml_diff>

<commit_message>
Added paddle and ball images
</commit_message>
<xml_diff>
--- a/BlockBreaker/Credits.docx
+++ b/BlockBreaker/Credits.docx
@@ -164,7 +164,6 @@
                 <w:szCs w:val="20"/>
               </w:rPr>
             </w:pPr>
-            <w:proofErr w:type="spellStart"/>
             <w:r>
               <w:rPr>
                 <w:sz w:val="20"/>
@@ -172,7 +171,6 @@
               </w:rPr>
               <w:t>InMotionAudio</w:t>
             </w:r>
-            <w:proofErr w:type="spellEnd"/>
           </w:p>
         </w:tc>
         <w:tc>
@@ -285,7 +283,6 @@
                 <w:szCs w:val="20"/>
               </w:rPr>
             </w:pPr>
-            <w:proofErr w:type="spellStart"/>
             <w:r>
               <w:rPr>
                 <w:sz w:val="20"/>
@@ -293,7 +290,6 @@
               </w:rPr>
               <w:t>magnuswaker</w:t>
             </w:r>
-            <w:proofErr w:type="spellEnd"/>
           </w:p>
         </w:tc>
         <w:tc>
@@ -316,6 +312,200 @@
                   <w:szCs w:val="20"/>
                 </w:rPr>
                 <w:t>https://freesound.org/s/540788/</w:t>
+              </w:r>
+            </w:hyperlink>
+          </w:p>
+        </w:tc>
+        <w:tc>
+          <w:tcPr>
+            <w:tcW w:w="1276" w:type="dxa"/>
+          </w:tcPr>
+          <w:p>
+            <w:pPr>
+              <w:cnfStyle w:val="000000000000" w:firstRow="0" w:lastRow="0" w:firstColumn="0" w:lastColumn="0" w:oddVBand="0" w:evenVBand="0" w:oddHBand="0" w:evenHBand="0" w:firstRowFirstColumn="0" w:firstRowLastColumn="0" w:lastRowFirstColumn="0" w:lastRowLastColumn="0"/>
+              <w:rPr>
+                <w:sz w:val="20"/>
+                <w:szCs w:val="20"/>
+              </w:rPr>
+            </w:pPr>
+            <w:r>
+              <w:rPr>
+                <w:sz w:val="20"/>
+                <w:szCs w:val="20"/>
+              </w:rPr>
+              <w:t>CC0</w:t>
+            </w:r>
+          </w:p>
+        </w:tc>
+      </w:tr>
+      <w:tr>
+        <w:trPr>
+          <w:cnfStyle w:val="000000100000" w:firstRow="0" w:lastRow="0" w:firstColumn="0" w:lastColumn="0" w:oddVBand="0" w:evenVBand="0" w:oddHBand="1" w:evenHBand="0" w:firstRowFirstColumn="0" w:firstRowLastColumn="0" w:lastRowFirstColumn="0" w:lastRowLastColumn="0"/>
+        </w:trPr>
+        <w:tc>
+          <w:tcPr>
+            <w:cnfStyle w:val="001000000000" w:firstRow="0" w:lastRow="0" w:firstColumn="1" w:lastColumn="0" w:oddVBand="0" w:evenVBand="0" w:oddHBand="0" w:evenHBand="0" w:firstRowFirstColumn="0" w:firstRowLastColumn="0" w:lastRowFirstColumn="0" w:lastRowLastColumn="0"/>
+            <w:tcW w:w="3681" w:type="dxa"/>
+          </w:tcPr>
+          <w:p>
+            <w:pPr>
+              <w:rPr>
+                <w:sz w:val="20"/>
+                <w:szCs w:val="20"/>
+              </w:rPr>
+            </w:pPr>
+            <w:r>
+              <w:rPr>
+                <w:sz w:val="20"/>
+                <w:szCs w:val="20"/>
+              </w:rPr>
+              <w:t>Tileable Brick Ground Textures - Set 2</w:t>
+            </w:r>
+          </w:p>
+        </w:tc>
+        <w:tc>
+          <w:tcPr>
+            <w:tcW w:w="1701" w:type="dxa"/>
+          </w:tcPr>
+          <w:p>
+            <w:pPr>
+              <w:cnfStyle w:val="000000100000" w:firstRow="0" w:lastRow="0" w:firstColumn="0" w:lastColumn="0" w:oddVBand="0" w:evenVBand="0" w:oddHBand="1" w:evenHBand="0" w:firstRowFirstColumn="0" w:firstRowLastColumn="0" w:lastRowFirstColumn="0" w:lastRowLastColumn="0"/>
+              <w:rPr>
+                <w:sz w:val="20"/>
+                <w:szCs w:val="20"/>
+              </w:rPr>
+            </w:pPr>
+            <w:hyperlink r:id="rId6" w:history="1">
+              <w:r>
+                <w:rPr>
+                  <w:rStyle w:val="Hyperlink"/>
+                  <w:b/>
+                  <w:bCs/>
+                  <w:sz w:val="20"/>
+                  <w:szCs w:val="20"/>
+                </w:rPr>
+                <w:t>Cethiel</w:t>
+              </w:r>
+            </w:hyperlink>
+          </w:p>
+        </w:tc>
+        <w:tc>
+          <w:tcPr>
+            <w:tcW w:w="3685" w:type="dxa"/>
+          </w:tcPr>
+          <w:p>
+            <w:pPr>
+              <w:cnfStyle w:val="000000100000" w:firstRow="0" w:lastRow="0" w:firstColumn="0" w:lastColumn="0" w:oddVBand="0" w:evenVBand="0" w:oddHBand="1" w:evenHBand="0" w:firstRowFirstColumn="0" w:firstRowLastColumn="0" w:lastRowFirstColumn="0" w:lastRowLastColumn="0"/>
+            </w:pPr>
+            <w:hyperlink r:id="rId7" w:history="1">
+              <w:r>
+                <w:rPr>
+                  <w:rStyle w:val="Hyperlink"/>
+                </w:rPr>
+                <w:t>https://opengameart.org/content/tileable-brick-ground-textures-set-2</w:t>
+              </w:r>
+            </w:hyperlink>
+          </w:p>
+        </w:tc>
+        <w:tc>
+          <w:tcPr>
+            <w:tcW w:w="1276" w:type="dxa"/>
+          </w:tcPr>
+          <w:p>
+            <w:pPr>
+              <w:cnfStyle w:val="000000100000" w:firstRow="0" w:lastRow="0" w:firstColumn="0" w:lastColumn="0" w:oddVBand="0" w:evenVBand="0" w:oddHBand="1" w:evenHBand="0" w:firstRowFirstColumn="0" w:firstRowLastColumn="0" w:lastRowFirstColumn="0" w:lastRowLastColumn="0"/>
+              <w:rPr>
+                <w:sz w:val="20"/>
+                <w:szCs w:val="20"/>
+              </w:rPr>
+            </w:pPr>
+            <w:r>
+              <w:rPr>
+                <w:sz w:val="20"/>
+                <w:szCs w:val="20"/>
+              </w:rPr>
+              <w:t>CC0</w:t>
+            </w:r>
+          </w:p>
+        </w:tc>
+      </w:tr>
+      <w:tr>
+        <w:tc>
+          <w:tcPr>
+            <w:cnfStyle w:val="001000000000" w:firstRow="0" w:lastRow="0" w:firstColumn="1" w:lastColumn="0" w:oddVBand="0" w:evenVBand="0" w:oddHBand="0" w:evenHBand="0" w:firstRowFirstColumn="0" w:firstRowLastColumn="0" w:lastRowFirstColumn="0" w:lastRowLastColumn="0"/>
+            <w:tcW w:w="3681" w:type="dxa"/>
+          </w:tcPr>
+          <w:p>
+            <w:pPr>
+              <w:rPr>
+                <w:sz w:val="20"/>
+                <w:szCs w:val="20"/>
+              </w:rPr>
+            </w:pPr>
+            <w:r>
+              <w:rPr>
+                <w:sz w:val="20"/>
+                <w:szCs w:val="20"/>
+              </w:rPr>
+              <w:t>Paddle and ball</w:t>
+            </w:r>
+          </w:p>
+          <w:p>
+            <w:pPr>
+              <w:rPr>
+                <w:sz w:val="20"/>
+                <w:szCs w:val="20"/>
+              </w:rPr>
+            </w:pPr>
+            <w:r>
+              <w:rPr>
+                <w:sz w:val="20"/>
+                <w:szCs w:val="20"/>
+              </w:rPr>
+              <w:t>Paddle.pgn, glasspaddle2.png and ball.png</w:t>
+            </w:r>
+          </w:p>
+        </w:tc>
+        <w:tc>
+          <w:tcPr>
+            <w:tcW w:w="1701" w:type="dxa"/>
+          </w:tcPr>
+          <w:p>
+            <w:pPr>
+              <w:cnfStyle w:val="000000000000" w:firstRow="0" w:lastRow="0" w:firstColumn="0" w:lastColumn="0" w:oddVBand="0" w:evenVBand="0" w:oddHBand="0" w:evenHBand="0" w:firstRowFirstColumn="0" w:firstRowLastColumn="0" w:lastRowFirstColumn="0" w:lastRowLastColumn="0"/>
+              <w:rPr>
+                <w:sz w:val="20"/>
+                <w:szCs w:val="20"/>
+              </w:rPr>
+            </w:pPr>
+            <w:hyperlink r:id="rId8" w:history="1">
+              <w:r>
+                <w:rPr>
+                  <w:rStyle w:val="Hyperlink"/>
+                  <w:b/>
+                  <w:bCs/>
+                  <w:sz w:val="20"/>
+                  <w:szCs w:val="20"/>
+                </w:rPr>
+                <w:t>Aj_</w:t>
+              </w:r>
+            </w:hyperlink>
+          </w:p>
+        </w:tc>
+        <w:tc>
+          <w:tcPr>
+            <w:tcW w:w="3685" w:type="dxa"/>
+          </w:tcPr>
+          <w:p>
+            <w:pPr>
+              <w:cnfStyle w:val="000000000000" w:firstRow="0" w:lastRow="0" w:firstColumn="0" w:lastColumn="0" w:oddVBand="0" w:evenVBand="0" w:oddHBand="0" w:evenHBand="0" w:firstRowFirstColumn="0" w:firstRowLastColumn="0" w:lastRowFirstColumn="0" w:lastRowLastColumn="0"/>
+            </w:pPr>
+            <w:hyperlink r:id="rId9" w:history="1">
+              <w:r>
+                <w:rPr>
+                  <w:rStyle w:val="Hyperlink"/>
+                </w:rPr>
+                <w:t>https://opengameart.org/content/paddle-and-ball</w:t>
               </w:r>
             </w:hyperlink>
           </w:p>
@@ -789,7 +979,6 @@
     <w:next w:val="Normal"/>
     <w:link w:val="Heading2Char"/>
     <w:uiPriority w:val="9"/>
-    <w:semiHidden/>
     <w:unhideWhenUsed/>
     <w:qFormat/>
     <w:rsid w:val="00D5369E"/>
@@ -964,7 +1153,6 @@
   <w:style w:type="character" w:default="1" w:styleId="DefaultParagraphFont">
     <w:name w:val="Default Paragraph Font"/>
     <w:uiPriority w:val="1"/>
-    <w:semiHidden/>
     <w:unhideWhenUsed/>
   </w:style>
   <w:style w:type="table" w:default="1" w:styleId="TableNormal">
@@ -1006,7 +1194,6 @@
     <w:basedOn w:val="DefaultParagraphFont"/>
     <w:link w:val="Heading2"/>
     <w:uiPriority w:val="9"/>
-    <w:semiHidden/>
     <w:rsid w:val="00D5369E"/>
     <w:rPr>
       <w:rFonts w:asciiTheme="majorHAnsi" w:eastAsiaTheme="majorEastAsia" w:hAnsiTheme="majorHAnsi" w:cstheme="majorBidi"/>

</xml_diff>